<commit_message>
WIP: remaining level gap-closing in progress
Co-Authored-By: Claude Sonnet 5.5 <noreply@anthropic.com>
Claude-Session: https://claude.ai/code/session_01NYgB3ju57UwWRpkPPM6X7F
</commit_message>
<xml_diff>
--- a/hp_base/P1_Holiday_Program_Student_Workbook.docx
+++ b/hp_base/P1_Holiday_Program_Student_Workbook.docx
@@ -17016,7 +17016,7 @@
       <w:r>
         <w:drawing>
           <wp:inline distT="0" distB="0" distL="0" distR="0">
-            <wp:extent cx="2381250" cy="1514475"/>
+            <wp:extent cx="1905000" cy="1209675"/>
             <wp:effectExtent t="0" r="0" b="0" l="0"/>
             <wp:docPr id="4" name="house.png" descr="house.png" title="house.png"/>
             <wp:cNvGraphicFramePr>
@@ -17041,7 +17041,7 @@
                   <pic:spPr bwMode="auto">
                     <a:xfrm>
                       <a:off x="0" y="0"/>
-                      <a:ext cx="2381250" cy="1514475"/>
+                      <a:ext cx="1905000" cy="1209675"/>
                     </a:xfrm>
                     <a:prstGeom prst="rect">
                       <a:avLst/>
@@ -17441,7 +17441,7 @@
       <w:r>
         <w:drawing>
           <wp:inline distT="0" distB="0" distL="0" distR="0">
-            <wp:extent cx="5334000" cy="1019175"/>
+            <wp:extent cx="4191000" cy="800100"/>
             <wp:effectExtent t="0" r="0" b="0" l="0"/>
             <wp:docPr id="5" name="shapes6.png" descr="shapes6.png" title="shapes6.png"/>
             <wp:cNvGraphicFramePr>
@@ -17466,7 +17466,7 @@
                   <pic:spPr bwMode="auto">
                     <a:xfrm>
                       <a:off x="0" y="0"/>
-                      <a:ext cx="5334000" cy="1019175"/>
+                      <a:ext cx="4191000" cy="800100"/>
                     </a:xfrm>
                     <a:prstGeom prst="rect">
                       <a:avLst/>
@@ -17623,9 +17623,9 @@
               <w:right w:val="single" w:color="000000" w:sz="8"/>
             </w:tcBorders>
             <w:tcMar>
-              <w:top w:type="dxa" w:w="50"/>
-              <w:left w:type="dxa" w:w="100"/>
-              <w:bottom w:type="dxa" w:w="50"/>
+              <w:top w:type="dxa" w:w="38"/>
+              <w:left w:type="dxa" w:w="100"/>
+              <w:bottom w:type="dxa" w:w="38"/>
               <w:right w:type="dxa" w:w="100"/>
             </w:tcMar>
             <w:vAlign w:val="center"/>
@@ -17658,9 +17658,9 @@
               <w:right w:val="single" w:color="000000" w:sz="8"/>
             </w:tcBorders>
             <w:tcMar>
-              <w:top w:type="dxa" w:w="50"/>
-              <w:left w:type="dxa" w:w="100"/>
-              <w:bottom w:type="dxa" w:w="50"/>
+              <w:top w:type="dxa" w:w="38"/>
+              <w:left w:type="dxa" w:w="100"/>
+              <w:bottom w:type="dxa" w:w="38"/>
               <w:right w:type="dxa" w:w="100"/>
             </w:tcMar>
             <w:vAlign w:val="center"/>
@@ -17693,9 +17693,9 @@
               <w:right w:val="single" w:color="000000" w:sz="8"/>
             </w:tcBorders>
             <w:tcMar>
-              <w:top w:type="dxa" w:w="50"/>
-              <w:left w:type="dxa" w:w="100"/>
-              <w:bottom w:type="dxa" w:w="50"/>
+              <w:top w:type="dxa" w:w="38"/>
+              <w:left w:type="dxa" w:w="100"/>
+              <w:bottom w:type="dxa" w:w="38"/>
               <w:right w:type="dxa" w:w="100"/>
             </w:tcMar>
             <w:vAlign w:val="center"/>
@@ -17733,9 +17733,9 @@
               <w:right w:val="single" w:color="000000" w:sz="8"/>
             </w:tcBorders>
             <w:tcMar>
-              <w:top w:type="dxa" w:w="50"/>
-              <w:left w:type="dxa" w:w="100"/>
-              <w:bottom w:type="dxa" w:w="50"/>
+              <w:top w:type="dxa" w:w="38"/>
+              <w:left w:type="dxa" w:w="100"/>
+              <w:bottom w:type="dxa" w:w="38"/>
               <w:right w:type="dxa" w:w="100"/>
             </w:tcMar>
             <w:vAlign w:val="center"/>
@@ -17768,9 +17768,9 @@
               <w:right w:val="single" w:color="000000" w:sz="8"/>
             </w:tcBorders>
             <w:tcMar>
-              <w:top w:type="dxa" w:w="50"/>
-              <w:left w:type="dxa" w:w="100"/>
-              <w:bottom w:type="dxa" w:w="50"/>
+              <w:top w:type="dxa" w:w="38"/>
+              <w:left w:type="dxa" w:w="100"/>
+              <w:bottom w:type="dxa" w:w="38"/>
               <w:right w:type="dxa" w:w="100"/>
             </w:tcMar>
             <w:vAlign w:val="center"/>
@@ -17803,9 +17803,9 @@
               <w:right w:val="single" w:color="000000" w:sz="8"/>
             </w:tcBorders>
             <w:tcMar>
-              <w:top w:type="dxa" w:w="50"/>
-              <w:left w:type="dxa" w:w="100"/>
-              <w:bottom w:type="dxa" w:w="50"/>
+              <w:top w:type="dxa" w:w="38"/>
+              <w:left w:type="dxa" w:w="100"/>
+              <w:bottom w:type="dxa" w:w="38"/>
               <w:right w:type="dxa" w:w="100"/>
             </w:tcMar>
             <w:vAlign w:val="center"/>
@@ -17843,9 +17843,9 @@
               <w:right w:val="single" w:color="000000" w:sz="8"/>
             </w:tcBorders>
             <w:tcMar>
-              <w:top w:type="dxa" w:w="50"/>
-              <w:left w:type="dxa" w:w="100"/>
-              <w:bottom w:type="dxa" w:w="50"/>
+              <w:top w:type="dxa" w:w="38"/>
+              <w:left w:type="dxa" w:w="100"/>
+              <w:bottom w:type="dxa" w:w="38"/>
               <w:right w:type="dxa" w:w="100"/>
             </w:tcMar>
             <w:vAlign w:val="center"/>
@@ -17878,9 +17878,9 @@
               <w:right w:val="single" w:color="000000" w:sz="8"/>
             </w:tcBorders>
             <w:tcMar>
-              <w:top w:type="dxa" w:w="50"/>
-              <w:left w:type="dxa" w:w="100"/>
-              <w:bottom w:type="dxa" w:w="50"/>
+              <w:top w:type="dxa" w:w="38"/>
+              <w:left w:type="dxa" w:w="100"/>
+              <w:bottom w:type="dxa" w:w="38"/>
               <w:right w:type="dxa" w:w="100"/>
             </w:tcMar>
             <w:vAlign w:val="center"/>
@@ -17913,9 +17913,9 @@
               <w:right w:val="single" w:color="000000" w:sz="8"/>
             </w:tcBorders>
             <w:tcMar>
-              <w:top w:type="dxa" w:w="50"/>
-              <w:left w:type="dxa" w:w="100"/>
-              <w:bottom w:type="dxa" w:w="50"/>
+              <w:top w:type="dxa" w:w="38"/>
+              <w:left w:type="dxa" w:w="100"/>
+              <w:bottom w:type="dxa" w:w="38"/>
               <w:right w:type="dxa" w:w="100"/>
             </w:tcMar>
             <w:vAlign w:val="center"/>
@@ -17953,9 +17953,9 @@
               <w:right w:val="single" w:color="000000" w:sz="8"/>
             </w:tcBorders>
             <w:tcMar>
-              <w:top w:type="dxa" w:w="50"/>
-              <w:left w:type="dxa" w:w="100"/>
-              <w:bottom w:type="dxa" w:w="50"/>
+              <w:top w:type="dxa" w:w="38"/>
+              <w:left w:type="dxa" w:w="100"/>
+              <w:bottom w:type="dxa" w:w="38"/>
               <w:right w:type="dxa" w:w="100"/>
             </w:tcMar>
             <w:vAlign w:val="center"/>
@@ -17988,9 +17988,9 @@
               <w:right w:val="single" w:color="000000" w:sz="8"/>
             </w:tcBorders>
             <w:tcMar>
-              <w:top w:type="dxa" w:w="50"/>
-              <w:left w:type="dxa" w:w="100"/>
-              <w:bottom w:type="dxa" w:w="50"/>
+              <w:top w:type="dxa" w:w="38"/>
+              <w:left w:type="dxa" w:w="100"/>
+              <w:bottom w:type="dxa" w:w="38"/>
               <w:right w:type="dxa" w:w="100"/>
             </w:tcMar>
             <w:vAlign w:val="center"/>
@@ -18023,9 +18023,9 @@
               <w:right w:val="single" w:color="000000" w:sz="8"/>
             </w:tcBorders>
             <w:tcMar>
-              <w:top w:type="dxa" w:w="50"/>
-              <w:left w:type="dxa" w:w="100"/>
-              <w:bottom w:type="dxa" w:w="50"/>
+              <w:top w:type="dxa" w:w="38"/>
+              <w:left w:type="dxa" w:w="100"/>
+              <w:bottom w:type="dxa" w:w="38"/>
               <w:right w:type="dxa" w:w="100"/>
             </w:tcMar>
             <w:vAlign w:val="center"/>
@@ -18063,9 +18063,9 @@
               <w:right w:val="single" w:color="000000" w:sz="8"/>
             </w:tcBorders>
             <w:tcMar>
-              <w:top w:type="dxa" w:w="50"/>
-              <w:left w:type="dxa" w:w="100"/>
-              <w:bottom w:type="dxa" w:w="50"/>
+              <w:top w:type="dxa" w:w="38"/>
+              <w:left w:type="dxa" w:w="100"/>
+              <w:bottom w:type="dxa" w:w="38"/>
               <w:right w:type="dxa" w:w="100"/>
             </w:tcMar>
             <w:vAlign w:val="center"/>
@@ -18098,9 +18098,9 @@
               <w:right w:val="single" w:color="000000" w:sz="8"/>
             </w:tcBorders>
             <w:tcMar>
-              <w:top w:type="dxa" w:w="50"/>
-              <w:left w:type="dxa" w:w="100"/>
-              <w:bottom w:type="dxa" w:w="50"/>
+              <w:top w:type="dxa" w:w="38"/>
+              <w:left w:type="dxa" w:w="100"/>
+              <w:bottom w:type="dxa" w:w="38"/>
               <w:right w:type="dxa" w:w="100"/>
             </w:tcMar>
             <w:vAlign w:val="center"/>
@@ -18133,9 +18133,9 @@
               <w:right w:val="single" w:color="000000" w:sz="8"/>
             </w:tcBorders>
             <w:tcMar>
-              <w:top w:type="dxa" w:w="50"/>
-              <w:left w:type="dxa" w:w="100"/>
-              <w:bottom w:type="dxa" w:w="50"/>
+              <w:top w:type="dxa" w:w="38"/>
+              <w:left w:type="dxa" w:w="100"/>
+              <w:bottom w:type="dxa" w:w="38"/>
               <w:right w:type="dxa" w:w="100"/>
             </w:tcMar>
             <w:vAlign w:val="center"/>
@@ -18173,9 +18173,9 @@
               <w:right w:val="single" w:color="000000" w:sz="8"/>
             </w:tcBorders>
             <w:tcMar>
-              <w:top w:type="dxa" w:w="50"/>
-              <w:left w:type="dxa" w:w="100"/>
-              <w:bottom w:type="dxa" w:w="50"/>
+              <w:top w:type="dxa" w:w="38"/>
+              <w:left w:type="dxa" w:w="100"/>
+              <w:bottom w:type="dxa" w:w="38"/>
               <w:right w:type="dxa" w:w="100"/>
             </w:tcMar>
             <w:vAlign w:val="center"/>
@@ -18208,9 +18208,9 @@
               <w:right w:val="single" w:color="000000" w:sz="8"/>
             </w:tcBorders>
             <w:tcMar>
-              <w:top w:type="dxa" w:w="50"/>
-              <w:left w:type="dxa" w:w="100"/>
-              <w:bottom w:type="dxa" w:w="50"/>
+              <w:top w:type="dxa" w:w="38"/>
+              <w:left w:type="dxa" w:w="100"/>
+              <w:bottom w:type="dxa" w:w="38"/>
               <w:right w:type="dxa" w:w="100"/>
             </w:tcMar>
             <w:vAlign w:val="center"/>
@@ -18243,9 +18243,9 @@
               <w:right w:val="single" w:color="000000" w:sz="8"/>
             </w:tcBorders>
             <w:tcMar>
-              <w:top w:type="dxa" w:w="50"/>
-              <w:left w:type="dxa" w:w="100"/>
-              <w:bottom w:type="dxa" w:w="50"/>
+              <w:top w:type="dxa" w:w="38"/>
+              <w:left w:type="dxa" w:w="100"/>
+              <w:bottom w:type="dxa" w:w="38"/>
               <w:right w:type="dxa" w:w="100"/>
             </w:tcMar>
             <w:vAlign w:val="center"/>

</xml_diff>